<commit_message>
1AS functions: formula/table/graph link and proof by counterexample
Co-Authored-By: Claude Opus 5.5 <noreply@anthropic.com>
Claude-Session: https://claude.ai/code/session_015WVgZKTbSWpZTjn6aZsqC9
</commit_message>
<xml_diff>
--- a/documents/1as/molakhas_omomiyat_dawal_1as.docx
+++ b/documents/1as/molakhas_omomiyat_dawal_1as.docx
@@ -253,7 +253,7 @@
                     <w:rPr>
                       <w:rtl/>
                     </w:rPr>
-                    <w:t xml:space="preserve">3. التمثيل البياني والقراءة البيانية</w:t>
+                    <w:t xml:space="preserve">3. الدستور ، جدول القيم والتمثيل البياني</w:t>
                   </w:r>
                 </w:p>
               </w:tc>
@@ -287,7 +287,7 @@
                     <w:rPr>
                       <w:rtl/>
                     </w:rPr>
-                    <w:t xml:space="preserve">4. الدالة الزوجية والدالة الفردية</w:t>
+                    <w:t xml:space="preserve">4. الشفعية والبرهان بمثال مضاد</w:t>
                   </w:r>
                 </w:p>
               </w:tc>
@@ -7370,6 +7370,1228 @@
         <w:spacing w:before="0" w:after="0"/>
       </w:pPr>
     </w:p>
+    <w:tbl>
+      <w:tblPr>
+        <w:tblW w:w="9864" w:type="dxa"/>
+        <w:jc w:val="center"/>
+        <w:tblBorders>
+          <w:top w:val="single" w:sz="10" w:space="0" w:color="9F5600"/>
+          <w:left w:val="single" w:sz="10" w:space="0" w:color="9F5600"/>
+          <w:bottom w:val="single" w:sz="10" w:space="0" w:color="9F5600"/>
+          <w:right w:val="single" w:sz="10" w:space="0" w:color="9F5600"/>
+          <w:insideH w:val="single" w:sz="10" w:space="0" w:color="9F5600"/>
+        </w:tblBorders>
+        <w:tblLayout w:type="fixed"/>
+        <w:tblCellMar>
+          <w:top w:w="40" w:type="dxa"/>
+          <w:left w:w="140" w:type="dxa"/>
+          <w:bottom w:w="60" w:type="dxa"/>
+          <w:right w:w="140" w:type="dxa"/>
+        </w:tblCellMar>
+      </w:tblPr>
+      <w:tblGrid>
+        <w:gridCol w:w="9864"/>
+      </w:tblGrid>
+      <w:tr>
+        <w:trPr>
+          <w:cantSplit/>
+        </w:trPr>
+        <w:tc>
+          <w:tcPr>
+            <w:tcW w:w="9864" w:type="dxa"/>
+            <w:shd w:val="clear" w:color="auto" w:fill="9F5600"/>
+          </w:tcPr>
+          <w:p>
+            <w:pPr>
+              <w:keepNext/>
+              <w:bidi/>
+              <w:spacing w:before="0" w:after="0"/>
+            </w:pPr>
+            <w:r>
+              <w:rPr>
+                <w:b/>
+                <w:bCs/>
+                <w:color w:val="FFFFFF"/>
+                <w:rtl/>
+              </w:rPr>
+              <w:t xml:space="preserve">من الدستور إلى جدول القيم إلى التمثيل البياني</w:t>
+            </w:r>
+          </w:p>
+        </w:tc>
+      </w:tr>
+      <w:tr>
+        <w:tc>
+          <w:tcPr>
+            <w:tcW w:w="9864" w:type="dxa"/>
+            <w:shd w:val="clear" w:color="auto" w:fill="FCF8F2"/>
+          </w:tcPr>
+          <w:p>
+            <w:pPr>
+              <w:bidi/>
+            </w:pPr>
+            <m:oMath>
+              <m:r>
+                <m:t>f</m:t>
+              </m:r>
+            </m:oMath>
+            <w:r>
+              <w:rPr>
+                <w:rtl/>
+              </w:rPr>
+              <w:t xml:space="preserve"> </w:t>
+            </w:r>
+            <w:r>
+              <w:rPr>
+                <w:rtl/>
+              </w:rPr>
+              <w:t xml:space="preserve">الدالة المعرّفة على</w:t>
+            </w:r>
+            <w:r>
+              <w:rPr>
+                <w:rtl/>
+              </w:rPr>
+              <w:t xml:space="preserve"> </w:t>
+            </w:r>
+            <m:oMath>
+              <m:d>
+                <m:dPr>
+                  <m:begChr m:val="["/>
+                  <m:endChr m:val="]"/>
+                  <m:sepChr m:val=""/>
+                  <m:grow/>
+                </m:dPr>
+                <m:e>
+                  <m:r>
+                    <m:rPr>
+                      <m:sty m:val="p"/>
+                    </m:rPr>
+                    <m:t>−</m:t>
+                  </m:r>
+                  <m:r>
+                    <m:t>1</m:t>
+                  </m:r>
+                  <m:r>
+                    <m:rPr>
+                      <m:sty m:val="p"/>
+                    </m:rPr>
+                    <m:t>;</m:t>
+                  </m:r>
+                  <m:r>
+                    <m:t>3</m:t>
+                  </m:r>
+                </m:e>
+              </m:d>
+            </m:oMath>
+            <w:r>
+              <w:rPr>
+                <w:rtl/>
+              </w:rPr>
+              <w:t xml:space="preserve"> </w:t>
+            </w:r>
+            <w:r>
+              <w:rPr>
+                <w:rtl/>
+              </w:rPr>
+              <w:t xml:space="preserve">بالدستور</w:t>
+            </w:r>
+            <w:r>
+              <w:rPr>
+                <w:rtl/>
+              </w:rPr>
+              <w:t xml:space="preserve"> </w:t>
+            </w:r>
+            <m:oMath>
+              <m:borderBox>
+                <m:e>
+                  <m:r>
+                    <m:t>f</m:t>
+                  </m:r>
+                  <m:d>
+                    <m:dPr>
+                      <m:begChr m:val="("/>
+                      <m:endChr m:val=")"/>
+                      <m:sepChr m:val=""/>
+                      <m:grow/>
+                    </m:dPr>
+                    <m:e>
+                      <m:r>
+                        <m:t>x</m:t>
+                      </m:r>
+                    </m:e>
+                  </m:d>
+                  <m:r>
+                    <m:rPr>
+                      <m:sty m:val="p"/>
+                    </m:rPr>
+                    <m:t>=</m:t>
+                  </m:r>
+                  <m:sSup>
+                    <m:e>
+                      <m:r>
+                        <m:t>x</m:t>
+                      </m:r>
+                    </m:e>
+                    <m:sup>
+                      <m:r>
+                        <m:t>2</m:t>
+                      </m:r>
+                    </m:sup>
+                  </m:sSup>
+                  <m:r>
+                    <m:rPr>
+                      <m:sty m:val="p"/>
+                    </m:rPr>
+                    <m:t>−</m:t>
+                  </m:r>
+                  <m:r>
+                    <m:t>2</m:t>
+                  </m:r>
+                  <m:r>
+                    <m:t>x</m:t>
+                  </m:r>
+                </m:e>
+              </m:borderBox>
+            </m:oMath>
+            <w:r>
+              <w:rPr>
+                <w:rtl/>
+              </w:rPr>
+              <w:t xml:space="preserve">.</w:t>
+            </w:r>
+          </w:p>
+          <w:p>
+            <w:pPr>
+              <w:numPr>
+                <w:ilvl w:val="0"/>
+                <w:numId w:val="1009"/>
+              </w:numPr>
+              <w:bidi/>
+            </w:pPr>
+            <w:r>
+              <w:rPr>
+                <w:b/>
+                <w:bCs/>
+                <w:rtl/>
+              </w:rPr>
+              <w:t xml:space="preserve">الدستور</w:t>
+            </w:r>
+            <w:r>
+              <w:rPr>
+                <w:b/>
+                <w:bCs/>
+                <w:rtl/>
+              </w:rPr>
+              <w:t xml:space="preserve"> </w:t>
+            </w:r>
+            <m:oMath>
+              <m:r>
+                <m:rPr>
+                  <m:sty m:val="p"/>
+                </m:rPr>
+                <m:t>→</m:t>
+              </m:r>
+            </m:oMath>
+            <w:r>
+              <w:rPr>
+                <w:b/>
+                <w:bCs/>
+                <w:rtl/>
+              </w:rPr>
+              <w:t xml:space="preserve"> </w:t>
+            </w:r>
+            <w:r>
+              <w:rPr>
+                <w:b/>
+                <w:bCs/>
+                <w:rtl/>
+              </w:rPr>
+              <w:t xml:space="preserve">جدول القيم:</w:t>
+            </w:r>
+            <w:r>
+              <w:rPr>
+                <w:rtl/>
+              </w:rPr>
+              <w:t xml:space="preserve"> </w:t>
+            </w:r>
+            <w:r>
+              <w:rPr>
+                <w:rtl/>
+              </w:rPr>
+              <w:t xml:space="preserve">نختار قيماً لـ</w:t>
+            </w:r>
+            <w:r>
+              <w:rPr>
+                <w:rtl/>
+              </w:rPr>
+              <w:t xml:space="preserve"> </w:t>
+            </w:r>
+            <m:oMath>
+              <m:r>
+                <m:t>x</m:t>
+              </m:r>
+            </m:oMath>
+            <w:r>
+              <w:rPr>
+                <w:rtl/>
+              </w:rPr>
+              <w:t xml:space="preserve"> </w:t>
+            </w:r>
+            <w:r>
+              <w:rPr>
+                <w:rtl/>
+              </w:rPr>
+              <w:t xml:space="preserve">ونحسب صورها (مثلاً</w:t>
+            </w:r>
+            <w:r>
+              <w:rPr>
+                <w:rtl/>
+              </w:rPr>
+              <w:t xml:space="preserve"> </w:t>
+            </w:r>
+            <m:oMath>
+              <m:r>
+                <m:t>f</m:t>
+              </m:r>
+              <m:d>
+                <m:dPr>
+                  <m:begChr m:val="("/>
+                  <m:endChr m:val=")"/>
+                  <m:sepChr m:val=""/>
+                  <m:grow/>
+                </m:dPr>
+                <m:e>
+                  <m:r>
+                    <m:rPr>
+                      <m:sty m:val="p"/>
+                    </m:rPr>
+                    <m:t>−</m:t>
+                  </m:r>
+                  <m:r>
+                    <m:t>1</m:t>
+                  </m:r>
+                </m:e>
+              </m:d>
+              <m:r>
+                <m:rPr>
+                  <m:sty m:val="p"/>
+                </m:rPr>
+                <m:t>=</m:t>
+              </m:r>
+              <m:r>
+                <m:t>1</m:t>
+              </m:r>
+              <m:r>
+                <m:rPr>
+                  <m:sty m:val="p"/>
+                </m:rPr>
+                <m:t>+</m:t>
+              </m:r>
+              <m:r>
+                <m:t>2</m:t>
+              </m:r>
+              <m:r>
+                <m:rPr>
+                  <m:sty m:val="p"/>
+                </m:rPr>
+                <m:t>=</m:t>
+              </m:r>
+              <m:r>
+                <m:t>3</m:t>
+              </m:r>
+            </m:oMath>
+            <w:r>
+              <w:rPr>
+                <w:rtl/>
+              </w:rPr>
+              <w:t xml:space="preserve"> </w:t>
+            </w:r>
+            <w:r>
+              <w:rPr>
+                <w:rtl/>
+              </w:rPr>
+              <w:t xml:space="preserve">،</w:t>
+            </w:r>
+            <w:r>
+              <w:rPr>
+                <w:rtl/>
+              </w:rPr>
+              <w:t xml:space="preserve"> </w:t>
+            </w:r>
+            <m:oMath>
+              <m:r>
+                <m:t>f</m:t>
+              </m:r>
+              <m:d>
+                <m:dPr>
+                  <m:begChr m:val="("/>
+                  <m:endChr m:val=")"/>
+                  <m:sepChr m:val=""/>
+                  <m:grow/>
+                </m:dPr>
+                <m:e>
+                  <m:r>
+                    <m:t>2</m:t>
+                  </m:r>
+                  <m:r>
+                    <m:rPr>
+                      <m:sty m:val="p"/>
+                    </m:rPr>
+                    <m:t>,</m:t>
+                  </m:r>
+                  <m:r>
+                    <m:t>5</m:t>
+                  </m:r>
+                </m:e>
+              </m:d>
+              <m:r>
+                <m:rPr>
+                  <m:sty m:val="p"/>
+                </m:rPr>
+                <m:t>=</m:t>
+              </m:r>
+              <m:r>
+                <m:t>6</m:t>
+              </m:r>
+              <m:r>
+                <m:rPr>
+                  <m:sty m:val="p"/>
+                </m:rPr>
+                <m:t>,</m:t>
+              </m:r>
+              <m:r>
+                <m:t>25</m:t>
+              </m:r>
+              <m:r>
+                <m:rPr>
+                  <m:sty m:val="p"/>
+                </m:rPr>
+                <m:t>−</m:t>
+              </m:r>
+              <m:r>
+                <m:t>5</m:t>
+              </m:r>
+              <m:r>
+                <m:rPr>
+                  <m:sty m:val="p"/>
+                </m:rPr>
+                <m:t>=</m:t>
+              </m:r>
+              <m:r>
+                <m:t>1</m:t>
+              </m:r>
+              <m:r>
+                <m:rPr>
+                  <m:sty m:val="p"/>
+                </m:rPr>
+                <m:t>,</m:t>
+              </m:r>
+              <m:r>
+                <m:t>25</m:t>
+              </m:r>
+            </m:oMath>
+            <w:r>
+              <w:rPr>
+                <w:rtl/>
+              </w:rPr>
+              <w:t xml:space="preserve">):</w:t>
+            </w:r>
+          </w:p>
+          <w:tbl>
+            <w:tblPr>
+              <w:tblStyle w:val="Table"/>
+              <w:tblW w:w="8195" w:type="dxa"/>
+              <w:jc w:val="center"/>
+              <w:tblInd w:w="720" w:type="dxa"/>
+              <w:tblBorders>
+                <w:top w:val="single" w:sz="4" w:space="0" w:color="000000"/>
+                <w:left w:val="single" w:sz="4" w:space="0" w:color="000000"/>
+                <w:bottom w:val="single" w:sz="4" w:space="0" w:color="000000"/>
+                <w:right w:val="single" w:sz="4" w:space="0" w:color="000000"/>
+                <w:insideH w:val="single" w:sz="4" w:space="0" w:color="000000"/>
+                <w:insideV w:val="single" w:sz="4" w:space="0" w:color="000000"/>
+              </w:tblBorders>
+              <w:tblLayout w:type="fixed"/>
+              <w:tblLook w:firstRow="1" w:lastRow="0" w:firstColumn="0" w:lastColumn="0" w:noHBand="0" w:noVBand="0" w:val="0020"/>
+            </w:tblPr>
+            <w:tblGrid>
+              <w:gridCol w:w="965"/>
+              <w:gridCol w:w="965"/>
+              <w:gridCol w:w="1345"/>
+              <w:gridCol w:w="870"/>
+              <w:gridCol w:w="965"/>
+              <w:gridCol w:w="870"/>
+              <w:gridCol w:w="1345"/>
+              <w:gridCol w:w="870"/>
+            </w:tblGrid>
+            <w:tr>
+              <w:trPr>
+                <w:tblHeader w:val="true"/>
+              </w:trPr>
+              <w:tc>
+                <w:tcPr>
+                  <w:tcW w:w="965" w:type="dxa"/>
+                  <w:shd w:val="clear" w:color="auto" w:fill="E4E7ED"/>
+                </w:tcPr>
+                <w:p>
+                  <w:pPr>
+                    <w:pStyle w:val="Compact"/>
+                    <w:bidi/>
+                    <w:jc w:val="center"/>
+                  </w:pPr>
+                  <w:r>
+                    <w:rPr>
+                      <w:rtl/>
+                    </w:rPr>
+                    <w:t xml:space="preserve"/>
+                  </w:r>
+                  <m:oMath>
+                    <m:r>
+                      <m:t>x</m:t>
+                    </m:r>
+                  </m:oMath>
+                </w:p>
+              </w:tc>
+              <w:tc>
+                <w:tcPr>
+                  <w:tcW w:w="965" w:type="dxa"/>
+                  <w:shd w:val="clear" w:color="auto" w:fill="E4E7ED"/>
+                </w:tcPr>
+                <w:p>
+                  <w:pPr>
+                    <w:pStyle w:val="Compact"/>
+                    <w:bidi/>
+                    <w:jc w:val="center"/>
+                  </w:pPr>
+                  <m:oMath>
+                    <m:r>
+                      <m:rPr>
+                        <m:sty m:val="p"/>
+                      </m:rPr>
+                      <m:t>−</m:t>
+                    </m:r>
+                    <m:r>
+                      <m:t>1</m:t>
+                    </m:r>
+                  </m:oMath>
+                </w:p>
+              </w:tc>
+              <w:tc>
+                <w:tcPr>
+                  <w:tcW w:w="1345" w:type="dxa"/>
+                  <w:shd w:val="clear" w:color="auto" w:fill="E4E7ED"/>
+                </w:tcPr>
+                <w:p>
+                  <w:pPr>
+                    <w:pStyle w:val="Compact"/>
+                    <w:bidi/>
+                    <w:jc w:val="center"/>
+                  </w:pPr>
+                  <m:oMath>
+                    <m:r>
+                      <m:rPr>
+                        <m:sty m:val="p"/>
+                      </m:rPr>
+                      <m:t>−</m:t>
+                    </m:r>
+                    <m:r>
+                      <m:t>0</m:t>
+                    </m:r>
+                    <m:r>
+                      <m:rPr>
+                        <m:sty m:val="p"/>
+                      </m:rPr>
+                      <m:t>,</m:t>
+                    </m:r>
+                    <m:r>
+                      <m:t>5</m:t>
+                    </m:r>
+                  </m:oMath>
+                </w:p>
+              </w:tc>
+              <w:tc>
+                <w:tcPr>
+                  <w:tcW w:w="870" w:type="dxa"/>
+                  <w:shd w:val="clear" w:color="auto" w:fill="E4E7ED"/>
+                </w:tcPr>
+                <w:p>
+                  <w:pPr>
+                    <w:pStyle w:val="Compact"/>
+                    <w:bidi/>
+                    <w:jc w:val="center"/>
+                  </w:pPr>
+                  <m:oMath>
+                    <m:r>
+                      <m:t>0</m:t>
+                    </m:r>
+                  </m:oMath>
+                </w:p>
+              </w:tc>
+              <w:tc>
+                <w:tcPr>
+                  <w:tcW w:w="965" w:type="dxa"/>
+                  <w:shd w:val="clear" w:color="auto" w:fill="E4E7ED"/>
+                </w:tcPr>
+                <w:p>
+                  <w:pPr>
+                    <w:pStyle w:val="Compact"/>
+                    <w:bidi/>
+                    <w:jc w:val="center"/>
+                  </w:pPr>
+                  <m:oMath>
+                    <m:r>
+                      <m:t>1</m:t>
+                    </m:r>
+                  </m:oMath>
+                </w:p>
+              </w:tc>
+              <w:tc>
+                <w:tcPr>
+                  <w:tcW w:w="870" w:type="dxa"/>
+                  <w:shd w:val="clear" w:color="auto" w:fill="E4E7ED"/>
+                </w:tcPr>
+                <w:p>
+                  <w:pPr>
+                    <w:pStyle w:val="Compact"/>
+                    <w:bidi/>
+                    <w:jc w:val="center"/>
+                  </w:pPr>
+                  <m:oMath>
+                    <m:r>
+                      <m:t>2</m:t>
+                    </m:r>
+                  </m:oMath>
+                </w:p>
+              </w:tc>
+              <w:tc>
+                <w:tcPr>
+                  <w:tcW w:w="1345" w:type="dxa"/>
+                  <w:shd w:val="clear" w:color="auto" w:fill="E4E7ED"/>
+                </w:tcPr>
+                <w:p>
+                  <w:pPr>
+                    <w:pStyle w:val="Compact"/>
+                    <w:bidi/>
+                    <w:jc w:val="center"/>
+                  </w:pPr>
+                  <m:oMath>
+                    <m:r>
+                      <m:t>2</m:t>
+                    </m:r>
+                    <m:r>
+                      <m:rPr>
+                        <m:sty m:val="p"/>
+                      </m:rPr>
+                      <m:t>,</m:t>
+                    </m:r>
+                    <m:r>
+                      <m:t>5</m:t>
+                    </m:r>
+                  </m:oMath>
+                </w:p>
+              </w:tc>
+              <w:tc>
+                <w:tcPr>
+                  <w:tcW w:w="870" w:type="dxa"/>
+                  <w:shd w:val="clear" w:color="auto" w:fill="E4E7ED"/>
+                </w:tcPr>
+                <w:p>
+                  <w:pPr>
+                    <w:pStyle w:val="Compact"/>
+                    <w:bidi/>
+                    <w:jc w:val="center"/>
+                  </w:pPr>
+                  <m:oMath>
+                    <m:r>
+                      <m:t>3</m:t>
+                    </m:r>
+                  </m:oMath>
+                </w:p>
+              </w:tc>
+            </w:tr>
+            <w:tr>
+              <w:tc>
+                <w:tcPr>
+                  <w:tcW w:w="965" w:type="dxa"/>
+                </w:tcPr>
+                <w:p>
+                  <w:pPr>
+                    <w:pStyle w:val="Compact"/>
+                    <w:bidi/>
+                    <w:jc w:val="center"/>
+                  </w:pPr>
+                  <m:oMath>
+                    <m:r>
+                      <m:t>f</m:t>
+                    </m:r>
+                    <m:d>
+                      <m:dPr>
+                        <m:begChr m:val="("/>
+                        <m:endChr m:val=")"/>
+                        <m:sepChr m:val=""/>
+                        <m:grow/>
+                      </m:dPr>
+                      <m:e>
+                        <m:r>
+                          <m:t>x</m:t>
+                        </m:r>
+                      </m:e>
+                    </m:d>
+                  </m:oMath>
+                </w:p>
+              </w:tc>
+              <w:tc>
+                <w:tcPr>
+                  <w:tcW w:w="965" w:type="dxa"/>
+                </w:tcPr>
+                <w:p>
+                  <w:pPr>
+                    <w:pStyle w:val="Compact"/>
+                    <w:bidi/>
+                    <w:jc w:val="center"/>
+                  </w:pPr>
+                  <m:oMath>
+                    <m:r>
+                      <m:t>3</m:t>
+                    </m:r>
+                  </m:oMath>
+                </w:p>
+              </w:tc>
+              <w:tc>
+                <w:tcPr>
+                  <w:tcW w:w="1345" w:type="dxa"/>
+                </w:tcPr>
+                <w:p>
+                  <w:pPr>
+                    <w:pStyle w:val="Compact"/>
+                    <w:bidi/>
+                    <w:jc w:val="center"/>
+                  </w:pPr>
+                  <m:oMath>
+                    <m:r>
+                      <m:t>1</m:t>
+                    </m:r>
+                    <m:r>
+                      <m:rPr>
+                        <m:sty m:val="p"/>
+                      </m:rPr>
+                      <m:t>,</m:t>
+                    </m:r>
+                    <m:r>
+                      <m:t>25</m:t>
+                    </m:r>
+                  </m:oMath>
+                </w:p>
+              </w:tc>
+              <w:tc>
+                <w:tcPr>
+                  <w:tcW w:w="870" w:type="dxa"/>
+                </w:tcPr>
+                <w:p>
+                  <w:pPr>
+                    <w:pStyle w:val="Compact"/>
+                    <w:bidi/>
+                    <w:jc w:val="center"/>
+                  </w:pPr>
+                  <m:oMath>
+                    <m:r>
+                      <m:t>0</m:t>
+                    </m:r>
+                  </m:oMath>
+                </w:p>
+              </w:tc>
+              <w:tc>
+                <w:tcPr>
+                  <w:tcW w:w="965" w:type="dxa"/>
+                </w:tcPr>
+                <w:p>
+                  <w:pPr>
+                    <w:pStyle w:val="Compact"/>
+                    <w:bidi/>
+                    <w:jc w:val="center"/>
+                  </w:pPr>
+                  <m:oMath>
+                    <m:r>
+                      <m:rPr>
+                        <m:sty m:val="p"/>
+                      </m:rPr>
+                      <m:t>−</m:t>
+                    </m:r>
+                    <m:r>
+                      <m:t>1</m:t>
+                    </m:r>
+                  </m:oMath>
+                </w:p>
+              </w:tc>
+              <w:tc>
+                <w:tcPr>
+                  <w:tcW w:w="870" w:type="dxa"/>
+                </w:tcPr>
+                <w:p>
+                  <w:pPr>
+                    <w:pStyle w:val="Compact"/>
+                    <w:bidi/>
+                    <w:jc w:val="center"/>
+                  </w:pPr>
+                  <m:oMath>
+                    <m:r>
+                      <m:t>0</m:t>
+                    </m:r>
+                  </m:oMath>
+                </w:p>
+              </w:tc>
+              <w:tc>
+                <w:tcPr>
+                  <w:tcW w:w="1345" w:type="dxa"/>
+                </w:tcPr>
+                <w:p>
+                  <w:pPr>
+                    <w:pStyle w:val="Compact"/>
+                    <w:bidi/>
+                    <w:jc w:val="center"/>
+                  </w:pPr>
+                  <m:oMath>
+                    <m:r>
+                      <m:t>1</m:t>
+                    </m:r>
+                    <m:r>
+                      <m:rPr>
+                        <m:sty m:val="p"/>
+                      </m:rPr>
+                      <m:t>,</m:t>
+                    </m:r>
+                    <m:r>
+                      <m:t>25</m:t>
+                    </m:r>
+                  </m:oMath>
+                </w:p>
+              </w:tc>
+              <w:tc>
+                <w:tcPr>
+                  <w:tcW w:w="870" w:type="dxa"/>
+                </w:tcPr>
+                <w:p>
+                  <w:pPr>
+                    <w:pStyle w:val="Compact"/>
+                    <w:bidi/>
+                    <w:jc w:val="center"/>
+                  </w:pPr>
+                  <m:oMath>
+                    <m:r>
+                      <m:t>3</m:t>
+                    </m:r>
+                  </m:oMath>
+                </w:p>
+              </w:tc>
+            </w:tr>
+          </w:tbl>
+          <w:p>
+            <w:pPr>
+              <w:numPr>
+                <w:ilvl w:val="0"/>
+                <w:numId w:val="1009"/>
+              </w:numPr>
+              <w:bidi/>
+              <w:spacing w:before="120"/>
+            </w:pPr>
+            <w:r>
+              <w:rPr>
+                <w:b/>
+                <w:bCs/>
+                <w:rtl/>
+              </w:rPr>
+              <w:t xml:space="preserve">جدول القيم</w:t>
+            </w:r>
+            <w:r>
+              <w:rPr>
+                <w:b/>
+                <w:bCs/>
+                <w:rtl/>
+              </w:rPr>
+              <w:t xml:space="preserve"> </w:t>
+            </w:r>
+            <m:oMath>
+              <m:r>
+                <m:rPr>
+                  <m:sty m:val="p"/>
+                </m:rPr>
+                <m:t>→</m:t>
+              </m:r>
+            </m:oMath>
+            <w:r>
+              <w:rPr>
+                <w:b/>
+                <w:bCs/>
+                <w:rtl/>
+              </w:rPr>
+              <w:t xml:space="preserve"> </w:t>
+            </w:r>
+            <w:r>
+              <w:rPr>
+                <w:b/>
+                <w:bCs/>
+                <w:rtl/>
+              </w:rPr>
+              <w:t xml:space="preserve">التمثيل البياني:</w:t>
+            </w:r>
+            <w:r>
+              <w:rPr>
+                <w:rtl/>
+              </w:rPr>
+              <w:t xml:space="preserve"> </w:t>
+            </w:r>
+            <w:r>
+              <w:rPr>
+                <w:rtl/>
+              </w:rPr>
+              <w:t xml:space="preserve">كل عمود من الجدول يعطي نقطة</w:t>
+            </w:r>
+            <w:r>
+              <w:rPr>
+                <w:rtl/>
+              </w:rPr>
+              <w:t xml:space="preserve"> </w:t>
+            </w:r>
+            <m:oMath>
+              <m:r>
+                <m:t>M</m:t>
+              </m:r>
+              <m:d>
+                <m:dPr>
+                  <m:begChr m:val="("/>
+                  <m:endChr m:val=")"/>
+                  <m:sepChr m:val=""/>
+                  <m:grow/>
+                </m:dPr>
+                <m:e>
+                  <m:r>
+                    <m:t>x</m:t>
+                  </m:r>
+                  <m:r>
+                    <m:rPr>
+                      <m:sty m:val="p"/>
+                    </m:rPr>
+                    <m:t>;</m:t>
+                  </m:r>
+                  <m:r>
+                    <m:t>f</m:t>
+                  </m:r>
+                  <m:d>
+                    <m:dPr>
+                      <m:begChr m:val="("/>
+                      <m:endChr m:val=")"/>
+                      <m:sepChr m:val=""/>
+                      <m:grow/>
+                    </m:dPr>
+                    <m:e>
+                      <m:r>
+                        <m:t>x</m:t>
+                      </m:r>
+                    </m:e>
+                  </m:d>
+                </m:e>
+              </m:d>
+            </m:oMath>
+            <w:r>
+              <w:rPr>
+                <w:rtl/>
+              </w:rPr>
+              <w:t xml:space="preserve"> </w:t>
+            </w:r>
+            <w:r>
+              <w:rPr>
+                <w:rtl/>
+              </w:rPr>
+              <w:t xml:space="preserve">نعلّمها في المعلم ، ثم نصل النقط بخط منحنٍ منتظم (وليس بقطع مستقيمة).</w:t>
+            </w:r>
+          </w:p>
+          <w:p>
+            <w:pPr>
+              <w:numPr>
+                <w:ilvl w:val="0"/>
+                <w:numId w:val="1009"/>
+              </w:numPr>
+              <w:bidi/>
+            </w:pPr>
+            <w:r>
+              <w:rPr>
+                <w:b/>
+                <w:bCs/>
+                <w:rtl/>
+              </w:rPr>
+              <w:t xml:space="preserve">التمثيل البياني</w:t>
+            </w:r>
+            <w:r>
+              <w:rPr>
+                <w:b/>
+                <w:bCs/>
+                <w:rtl/>
+              </w:rPr>
+              <w:t xml:space="preserve"> </w:t>
+            </w:r>
+            <m:oMath>
+              <m:r>
+                <m:rPr>
+                  <m:sty m:val="p"/>
+                </m:rPr>
+                <m:t>→</m:t>
+              </m:r>
+            </m:oMath>
+            <w:r>
+              <w:rPr>
+                <w:b/>
+                <w:bCs/>
+                <w:rtl/>
+              </w:rPr>
+              <w:t xml:space="preserve"> </w:t>
+            </w:r>
+            <w:r>
+              <w:rPr>
+                <w:b/>
+                <w:bCs/>
+                <w:rtl/>
+              </w:rPr>
+              <w:t xml:space="preserve">جدول القيم:</w:t>
+            </w:r>
+            <w:r>
+              <w:rPr>
+                <w:rtl/>
+              </w:rPr>
+              <w:t xml:space="preserve"> </w:t>
+            </w:r>
+            <w:r>
+              <w:rPr>
+                <w:rtl/>
+              </w:rPr>
+              <w:t xml:space="preserve">بالعكس ، نقرأ من المنحنى ترتيب نقطة ذات فاصلة معلومة (قراءة تقريبية).</w:t>
+            </w:r>
+          </w:p>
+          <w:tbl>
+            <w:tblPr>
+              <w:tblW w:w="9977" w:type="dxa"/>
+              <w:jc w:val="center"/>
+              <w:tblBorders>
+                <w:top w:val="nil" w:sz="0" w:space="0" w:color="FFFFFF"/>
+                <w:left w:val="nil" w:sz="0" w:space="0" w:color="FFFFFF"/>
+                <w:bottom w:val="nil" w:sz="0" w:space="0" w:color="FFFFFF"/>
+                <w:right w:val="nil" w:sz="0" w:space="0" w:color="FFFFFF"/>
+                <w:insideH w:val="nil" w:sz="0" w:space="0" w:color="FFFFFF"/>
+                <w:insideV w:val="nil" w:sz="0" w:space="0" w:color="FFFFFF"/>
+              </w:tblBorders>
+              <w:tblLayout w:type="fixed"/>
+            </w:tblPr>
+            <w:tblGrid>
+              <w:gridCol w:w="3184"/>
+              <w:gridCol w:w="6793"/>
+            </w:tblGrid>
+            <w:tr>
+              <w:tc>
+                <w:tcPr>
+                  <w:tcW w:w="3184" w:type="dxa"/>
+                </w:tcPr>
+                <w:p>
+                  <w:pPr>
+                    <w:bidi/>
+                    <w:jc w:val="center"/>
+                  </w:pPr>
+                  <w:r>
+                    <w:rPr>
+                      <w:rtl/>
+                    </w:rPr>
+                    <w:drawing>
+                      <wp:inline>
+                        <wp:extent cx="1805940" cy="1348740"/>
+                        <wp:docPr id="4" name="Picture 4"/>
+                        <wp:cNvGraphicFramePr>
+                          <a:graphicFrameLocks noChangeAspect="1"/>
+                        </wp:cNvGraphicFramePr>
+                        <a:graphic>
+                          <a:graphicData uri="http://schemas.openxmlformats.org/drawingml/2006/picture">
+                            <pic:pic>
+                              <pic:nvPicPr>
+                                <pic:cNvPr id="0" name="24f59cc6f8f85121.png"/>
+                                <pic:cNvPicPr/>
+                              </pic:nvPicPr>
+                              <pic:blipFill>
+                                <a:blip r:embed="rId12"/>
+                                <a:stretch>
+                                  <a:fillRect/>
+                                </a:stretch>
+                              </pic:blipFill>
+                              <pic:spPr>
+                                <a:xfrm>
+                                  <a:off x="0" y="0"/>
+                                  <a:ext cx="1805940" cy="1348740"/>
+                                </a:xfrm>
+                                <a:prstGeom prst="rect"/>
+                              </pic:spPr>
+                            </pic:pic>
+                          </a:graphicData>
+                        </a:graphic>
+                      </wp:inline>
+                    </w:drawing>
+                  </w:r>
+                </w:p>
+              </w:tc>
+              <w:tc>
+                <w:tcPr>
+                  <w:tcW w:w="6793" w:type="dxa"/>
+                </w:tcPr>
+                <w:p>
+                  <w:pPr>
+                    <w:bidi/>
+                  </w:pPr>
+                  <w:r>
+                    <w:rPr>
+                      <w:b/>
+                      <w:bCs/>
+                      <w:rtl/>
+                    </w:rPr>
+                    <w:t xml:space="preserve">الحاسبة البيانية:</w:t>
+                  </w:r>
+                  <w:r>
+                    <w:rPr>
+                      <w:rtl/>
+                    </w:rPr>
+                    <w:t xml:space="preserve"> </w:t>
+                  </w:r>
+                  <w:r>
+                    <w:rPr>
+                      <w:rtl/>
+                    </w:rPr>
+                    <w:t xml:space="preserve">نُدخل الدستور</w:t>
+                  </w:r>
+                  <w:r>
+                    <w:rPr>
+                      <w:rtl/>
+                    </w:rPr>
+                    <w:t xml:space="preserve"> </w:t>
+                  </w:r>
+                  <m:oMath>
+                    <m:sSub>
+                      <m:e>
+                        <m:r>
+                          <m:t>Y</m:t>
+                        </m:r>
+                      </m:e>
+                      <m:sub>
+                        <m:r>
+                          <m:t>1</m:t>
+                        </m:r>
+                      </m:sub>
+                    </m:sSub>
+                    <m:r>
+                      <m:rPr>
+                        <m:sty m:val="p"/>
+                      </m:rPr>
+                      <m:t>=</m:t>
+                    </m:r>
+                    <m:sSup>
+                      <m:e>
+                        <m:r>
+                          <m:t>X</m:t>
+                        </m:r>
+                      </m:e>
+                      <m:sup>
+                        <m:r>
+                          <m:t>2</m:t>
+                        </m:r>
+                      </m:sup>
+                    </m:sSup>
+                    <m:r>
+                      <m:rPr>
+                        <m:sty m:val="p"/>
+                      </m:rPr>
+                      <m:t>−</m:t>
+                    </m:r>
+                    <m:r>
+                      <m:t>2</m:t>
+                    </m:r>
+                    <m:r>
+                      <m:t>X</m:t>
+                    </m:r>
+                  </m:oMath>
+                  <w:r>
+                    <w:rPr>
+                      <w:rtl/>
+                    </w:rPr>
+                    <w:t xml:space="preserve"> </w:t>
+                  </w:r>
+                  <w:r>
+                    <w:rPr>
+                      <w:rtl/>
+                    </w:rPr>
+                    <w:t xml:space="preserve">في وضع الدوال ، ثم نستعمل وضع الجدول (</w:t>
+                  </w:r>
+                  <w:r>
+                    <w:rPr>
+                      <w:shd w:val="clear" w:color="auto" w:fill="E4EAF3"/>
+                      <w:rtl/>
+                    </w:rPr>
+                    <w:t xml:space="preserve">‎Table</w:t>
+                  </w:r>
+                  <w:r>
+                    <w:rPr>
+                      <w:rtl/>
+                    </w:rPr>
+                    <w:t xml:space="preserve">) لنحصل على جدول القيم ، ووضع الرسم (</w:t>
+                  </w:r>
+                  <w:r>
+                    <w:rPr>
+                      <w:shd w:val="clear" w:color="auto" w:fill="E4EAF3"/>
+                      <w:rtl/>
+                    </w:rPr>
+                    <w:t xml:space="preserve">‎Graph</w:t>
+                  </w:r>
+                  <w:r>
+                    <w:rPr>
+                      <w:rtl/>
+                    </w:rPr>
+                    <w:t xml:space="preserve">) لنحصل على المنحنى.</w:t>
+                  </w:r>
+                </w:p>
+                <w:p>
+                  <w:pPr>
+                    <w:bidi/>
+                  </w:pPr>
+                  <w:r>
+                    <w:rPr>
+                      <w:b/>
+                      <w:bCs/>
+                      <w:rtl/>
+                    </w:rPr>
+                    <w:t xml:space="preserve">تنبيه:</w:t>
+                  </w:r>
+                  <w:r>
+                    <w:rPr>
+                      <w:rtl/>
+                    </w:rPr>
+                    <w:t xml:space="preserve"> </w:t>
+                  </w:r>
+                  <w:r>
+                    <w:rPr>
+                      <w:rtl/>
+                    </w:rPr>
+                    <w:t xml:space="preserve">الجدول يعطي عدداً محدوداً من النقط ؛ لا نستنتج منه وحده سلوك الدالة بين هذه النقط.</w:t>
+                  </w:r>
+                </w:p>
+              </w:tc>
+            </w:tr>
+          </w:tbl>
+          <w:p>
+            <w:pPr>
+              <w:bidi/>
+              <w:spacing w:before="120"/>
+            </w:pPr>
+          </w:p>
+        </w:tc>
+      </w:tr>
+    </w:tbl>
+    <w:p>
+      <w:pPr>
+        <w:bidi/>
+        <w:spacing w:before="0" w:after="0"/>
+      </w:pPr>
+    </w:p>
     <w:bookmarkEnd w:id="22"/>
     <w:bookmarkStart w:id="23" w:name="الدالة-الزوجية-والدالة-الفردية"/>
     <w:p>
@@ -7606,7 +8828,7 @@
             <w:pPr>
               <w:numPr>
                 <w:ilvl w:val="0"/>
-                <w:numId w:val="1009"/>
+                <w:numId w:val="1010"/>
               </w:numPr>
               <w:bidi/>
             </w:pPr>
@@ -7737,7 +8959,7 @@
             <w:pPr>
               <w:numPr>
                 <w:ilvl w:val="0"/>
-                <w:numId w:val="1009"/>
+                <w:numId w:val="1010"/>
               </w:numPr>
               <w:bidi/>
             </w:pPr>
@@ -7969,7 +9191,7 @@
                     <w:drawing>
                       <wp:inline>
                         <wp:extent cx="1860804" cy="891540"/>
-                        <wp:docPr id="4" name="Picture 4"/>
+                        <wp:docPr id="5" name="Picture 5"/>
                         <wp:cNvGraphicFramePr>
                           <a:graphicFrameLocks noChangeAspect="1"/>
                         </wp:cNvGraphicFramePr>
@@ -7981,7 +9203,7 @@
                                 <pic:cNvPicPr/>
                               </pic:nvPicPr>
                               <pic:blipFill>
-                                <a:blip r:embed="rId12"/>
+                                <a:blip r:embed="rId13"/>
                                 <a:stretch>
                                   <a:fillRect/>
                                 </a:stretch>
@@ -8009,7 +9231,7 @@
                   <w:pPr>
                     <w:numPr>
                       <w:ilvl w:val="0"/>
-                      <w:numId w:val="1010"/>
+                      <w:numId w:val="1011"/>
                     </w:numPr>
                     <w:bidi/>
                   </w:pPr>
@@ -8099,7 +9321,7 @@
                   <w:pPr>
                     <w:numPr>
                       <w:ilvl w:val="0"/>
-                      <w:numId w:val="1010"/>
+                      <w:numId w:val="1011"/>
                     </w:numPr>
                     <w:bidi/>
                   </w:pPr>
@@ -8275,7 +9497,7 @@
             <w:pPr>
               <w:numPr>
                 <w:ilvl w:val="0"/>
-                <w:numId w:val="1011"/>
+                <w:numId w:val="1012"/>
               </w:numPr>
               <w:bidi/>
             </w:pPr>
@@ -8539,7 +9761,7 @@
             <w:pPr>
               <w:numPr>
                 <w:ilvl w:val="0"/>
-                <w:numId w:val="1011"/>
+                <w:numId w:val="1012"/>
               </w:numPr>
               <w:bidi/>
             </w:pPr>
@@ -8809,7 +10031,7 @@
             <w:pPr>
               <w:numPr>
                 <w:ilvl w:val="0"/>
-                <w:numId w:val="1011"/>
+                <w:numId w:val="1012"/>
               </w:numPr>
               <w:bidi/>
             </w:pPr>
@@ -9118,7 +10340,7 @@
             <w:pPr>
               <w:numPr>
                 <w:ilvl w:val="0"/>
-                <w:numId w:val="1011"/>
+                <w:numId w:val="1012"/>
               </w:numPr>
               <w:bidi/>
             </w:pPr>
@@ -9337,6 +10559,1160 @@
               </w:rPr>
               <w:t xml:space="preserve">لا زوجية ولا فردية</w:t>
             </w:r>
+            <w:r>
+              <w:rPr>
+                <w:rtl/>
+              </w:rPr>
+              <w:t xml:space="preserve">.</w:t>
+            </w:r>
+          </w:p>
+        </w:tc>
+      </w:tr>
+    </w:tbl>
+    <w:p>
+      <w:pPr>
+        <w:bidi/>
+        <w:spacing w:before="0" w:after="0"/>
+      </w:pPr>
+    </w:p>
+    <w:tbl>
+      <w:tblPr>
+        <w:tblW w:w="9864" w:type="dxa"/>
+        <w:jc w:val="center"/>
+        <w:tblBorders>
+          <w:top w:val="single" w:sz="10" w:space="0" w:color="55167B"/>
+          <w:left w:val="single" w:sz="10" w:space="0" w:color="55167B"/>
+          <w:bottom w:val="single" w:sz="10" w:space="0" w:color="55167B"/>
+          <w:right w:val="single" w:sz="10" w:space="0" w:color="55167B"/>
+          <w:insideH w:val="single" w:sz="10" w:space="0" w:color="55167B"/>
+        </w:tblBorders>
+        <w:tblLayout w:type="fixed"/>
+        <w:tblCellMar>
+          <w:top w:w="40" w:type="dxa"/>
+          <w:left w:w="140" w:type="dxa"/>
+          <w:bottom w:w="60" w:type="dxa"/>
+          <w:right w:w="140" w:type="dxa"/>
+        </w:tblCellMar>
+      </w:tblPr>
+      <w:tblGrid>
+        <w:gridCol w:w="9864"/>
+      </w:tblGrid>
+      <w:tr>
+        <w:trPr>
+          <w:cantSplit/>
+        </w:trPr>
+        <w:tc>
+          <w:tcPr>
+            <w:tcW w:w="9864" w:type="dxa"/>
+            <w:shd w:val="clear" w:color="auto" w:fill="55167B"/>
+          </w:tcPr>
+          <w:p>
+            <w:pPr>
+              <w:keepNext/>
+              <w:bidi/>
+              <w:spacing w:before="0" w:after="0"/>
+            </w:pPr>
+            <w:r>
+              <w:rPr>
+                <w:b/>
+                <w:bCs/>
+                <w:color w:val="FFFFFF"/>
+                <w:rtl/>
+              </w:rPr>
+              <w:t xml:space="preserve">البرهان بمثال مضاد</w:t>
+            </w:r>
+          </w:p>
+        </w:tc>
+      </w:tr>
+      <w:tr>
+        <w:tc>
+          <w:tcPr>
+            <w:tcW w:w="9864" w:type="dxa"/>
+            <w:shd w:val="clear" w:color="auto" w:fill="F8F4FA"/>
+          </w:tcPr>
+          <w:p>
+            <w:pPr>
+              <w:bidi/>
+            </w:pPr>
+            <w:r>
+              <w:rPr>
+                <w:rtl/>
+              </w:rPr>
+              <w:t xml:space="preserve">لنبيّن أن عبارة من الشكل «</w:t>
+            </w:r>
+            <w:r>
+              <w:rPr>
+                <w:b/>
+                <w:bCs/>
+                <w:rtl/>
+              </w:rPr>
+              <w:t xml:space="preserve">من أجل كل</w:t>
+            </w:r>
+            <w:r>
+              <w:rPr>
+                <w:rtl/>
+              </w:rPr>
+              <w:t xml:space="preserve"> </w:t>
+            </w:r>
+            <m:oMath>
+              <m:r>
+                <m:t>x</m:t>
+              </m:r>
+            </m:oMath>
+            <w:r>
+              <w:rPr>
+                <w:rtl/>
+              </w:rPr>
+              <w:t xml:space="preserve"> </w:t>
+            </w:r>
+            <m:oMath>
+              <m:r>
+                <m:rPr>
+                  <m:sty m:val="p"/>
+                </m:rPr>
+                <m:t>…</m:t>
+              </m:r>
+            </m:oMath>
+            <w:r>
+              <w:rPr>
+                <w:rtl/>
+              </w:rPr>
+              <w:t xml:space="preserve">»</w:t>
+            </w:r>
+            <w:r>
+              <w:rPr>
+                <w:rtl/>
+              </w:rPr>
+              <w:t xml:space="preserve"> </w:t>
+            </w:r>
+            <w:r>
+              <w:rPr>
+                <w:b/>
+                <w:bCs/>
+                <w:rtl/>
+              </w:rPr>
+              <w:t xml:space="preserve">خاطئة</w:t>
+            </w:r>
+            <w:r>
+              <w:rPr>
+                <w:rtl/>
+              </w:rPr>
+              <w:t xml:space="preserve"> </w:t>
+            </w:r>
+            <w:r>
+              <w:rPr>
+                <w:rtl/>
+              </w:rPr>
+              <w:t xml:space="preserve">، يكفي إيجاد</w:t>
+            </w:r>
+            <w:r>
+              <w:rPr>
+                <w:rtl/>
+              </w:rPr>
+              <w:t xml:space="preserve"> </w:t>
+            </w:r>
+            <w:r>
+              <w:rPr>
+                <w:b/>
+                <w:bCs/>
+                <w:rtl/>
+              </w:rPr>
+              <w:t xml:space="preserve">مثال واحد</w:t>
+            </w:r>
+            <w:r>
+              <w:rPr>
+                <w:rtl/>
+              </w:rPr>
+              <w:t xml:space="preserve"> </w:t>
+            </w:r>
+            <w:r>
+              <w:rPr>
+                <w:rtl/>
+              </w:rPr>
+              <w:t xml:space="preserve">(قيمة واحدة لـ</w:t>
+            </w:r>
+            <w:r>
+              <w:rPr>
+                <w:rtl/>
+              </w:rPr>
+              <w:t xml:space="preserve"> </w:t>
+            </w:r>
+            <m:oMath>
+              <m:r>
+                <m:t>x</m:t>
+              </m:r>
+            </m:oMath>
+            <w:r>
+              <w:rPr>
+                <w:rtl/>
+              </w:rPr>
+              <w:t xml:space="preserve">) لا تتحقق من أجله.  هذا المثال يسمى</w:t>
+            </w:r>
+            <w:r>
+              <w:rPr>
+                <w:rtl/>
+              </w:rPr>
+              <w:t xml:space="preserve"> </w:t>
+            </w:r>
+            <w:r>
+              <w:rPr>
+                <w:b/>
+                <w:bCs/>
+                <w:rtl/>
+              </w:rPr>
+              <w:t xml:space="preserve">مثالاً مضاداً</w:t>
+            </w:r>
+            <w:r>
+              <w:rPr>
+                <w:rtl/>
+              </w:rPr>
+              <w:t xml:space="preserve">.</w:t>
+            </w:r>
+          </w:p>
+          <w:p>
+            <w:pPr>
+              <w:bidi/>
+            </w:pPr>
+            <w:r>
+              <w:rPr>
+                <w:b/>
+                <w:bCs/>
+                <w:rtl/>
+              </w:rPr>
+              <w:t xml:space="preserve">تنبيه:</w:t>
+            </w:r>
+            <w:r>
+              <w:rPr>
+                <w:rtl/>
+              </w:rPr>
+              <w:t xml:space="preserve"> </w:t>
+            </w:r>
+            <w:r>
+              <w:rPr>
+                <w:rtl/>
+              </w:rPr>
+              <w:t xml:space="preserve">لإثبات أن العبارة</w:t>
+            </w:r>
+            <w:r>
+              <w:rPr>
+                <w:rtl/>
+              </w:rPr>
+              <w:t xml:space="preserve"> </w:t>
+            </w:r>
+            <w:r>
+              <w:rPr>
+                <w:b/>
+                <w:bCs/>
+                <w:rtl/>
+              </w:rPr>
+              <w:t xml:space="preserve">صحيحة</w:t>
+            </w:r>
+            <w:r>
+              <w:rPr>
+                <w:rtl/>
+              </w:rPr>
+              <w:t xml:space="preserve"> </w:t>
+            </w:r>
+            <w:r>
+              <w:rPr>
+                <w:rtl/>
+              </w:rPr>
+              <w:t xml:space="preserve">لا تكفي الأمثلة مهما كثرت ، بل يجب برهان عام.</w:t>
+            </w:r>
+          </w:p>
+        </w:tc>
+      </w:tr>
+    </w:tbl>
+    <w:p>
+      <w:pPr>
+        <w:bidi/>
+        <w:spacing w:before="0" w:after="0"/>
+      </w:pPr>
+    </w:p>
+    <w:tbl>
+      <w:tblPr>
+        <w:tblW w:w="9864" w:type="dxa"/>
+        <w:jc w:val="center"/>
+        <w:tblBorders>
+          <w:top w:val="single" w:sz="10" w:space="0" w:color="9F5600"/>
+          <w:left w:val="single" w:sz="10" w:space="0" w:color="9F5600"/>
+          <w:bottom w:val="single" w:sz="10" w:space="0" w:color="9F5600"/>
+          <w:right w:val="single" w:sz="10" w:space="0" w:color="9F5600"/>
+          <w:insideH w:val="single" w:sz="10" w:space="0" w:color="9F5600"/>
+        </w:tblBorders>
+        <w:tblLayout w:type="fixed"/>
+        <w:tblCellMar>
+          <w:top w:w="40" w:type="dxa"/>
+          <w:left w:w="140" w:type="dxa"/>
+          <w:bottom w:w="60" w:type="dxa"/>
+          <w:right w:w="140" w:type="dxa"/>
+        </w:tblCellMar>
+      </w:tblPr>
+      <w:tblGrid>
+        <w:gridCol w:w="9864"/>
+      </w:tblGrid>
+      <w:tr>
+        <w:trPr>
+          <w:cantSplit/>
+        </w:trPr>
+        <w:tc>
+          <w:tcPr>
+            <w:tcW w:w="9864" w:type="dxa"/>
+            <w:shd w:val="clear" w:color="auto" w:fill="9F5600"/>
+          </w:tcPr>
+          <w:p>
+            <w:pPr>
+              <w:keepNext/>
+              <w:bidi/>
+              <w:spacing w:before="0" w:after="0"/>
+            </w:pPr>
+            <w:r>
+              <w:rPr>
+                <w:b/>
+                <w:bCs/>
+                <w:color w:val="FFFFFF"/>
+                <w:rtl/>
+              </w:rPr>
+              <w:t xml:space="preserve">مثال</w:t>
+            </w:r>
+          </w:p>
+        </w:tc>
+      </w:tr>
+      <w:tr>
+        <w:tc>
+          <w:tcPr>
+            <w:tcW w:w="9864" w:type="dxa"/>
+            <w:shd w:val="clear" w:color="auto" w:fill="FCF8F2"/>
+          </w:tcPr>
+          <w:p>
+            <w:pPr>
+              <w:numPr>
+                <w:ilvl w:val="0"/>
+                <w:numId w:val="1013"/>
+              </w:numPr>
+              <w:bidi/>
+            </w:pPr>
+            <w:r>
+              <w:rPr>
+                <w:rtl/>
+              </w:rPr>
+              <w:t xml:space="preserve">«الدالة</w:t>
+            </w:r>
+            <w:r>
+              <w:rPr>
+                <w:rtl/>
+              </w:rPr>
+              <w:t xml:space="preserve"> </w:t>
+            </w:r>
+            <m:oMath>
+              <m:r>
+                <m:t>h</m:t>
+              </m:r>
+              <m:r>
+                <m:rPr>
+                  <m:sty m:val="p"/>
+                </m:rPr>
+                <m:t>:</m:t>
+              </m:r>
+              <m:r>
+                <m:t>x</m:t>
+              </m:r>
+              <m:r>
+                <m:rPr>
+                  <m:sty m:val="p"/>
+                </m:rPr>
+                <m:t>↦</m:t>
+              </m:r>
+              <m:sSup>
+                <m:e>
+                  <m:r>
+                    <m:t>x</m:t>
+                  </m:r>
+                </m:e>
+                <m:sup>
+                  <m:r>
+                    <m:t>2</m:t>
+                  </m:r>
+                </m:sup>
+              </m:sSup>
+              <m:r>
+                <m:rPr>
+                  <m:sty m:val="p"/>
+                </m:rPr>
+                <m:t>+</m:t>
+              </m:r>
+              <m:r>
+                <m:t>x</m:t>
+              </m:r>
+            </m:oMath>
+            <w:r>
+              <w:rPr>
+                <w:rtl/>
+              </w:rPr>
+              <w:t xml:space="preserve"> </w:t>
+            </w:r>
+            <w:r>
+              <w:rPr>
+                <w:rtl/>
+              </w:rPr>
+              <w:t xml:space="preserve">زوجية»:</w:t>
+            </w:r>
+            <w:r>
+              <w:rPr>
+                <w:rtl/>
+              </w:rPr>
+              <w:t xml:space="preserve"> </w:t>
+            </w:r>
+            <w:r>
+              <w:rPr>
+                <w:b/>
+                <w:bCs/>
+                <w:rtl/>
+              </w:rPr>
+              <w:t xml:space="preserve">خاطئة</w:t>
+            </w:r>
+            <w:r>
+              <w:rPr>
+                <w:rtl/>
+              </w:rPr>
+              <w:t xml:space="preserve"> </w:t>
+            </w:r>
+            <w:r>
+              <w:rPr>
+                <w:rtl/>
+              </w:rPr>
+              <w:t xml:space="preserve">، لأن</w:t>
+            </w:r>
+            <w:r>
+              <w:rPr>
+                <w:rtl/>
+              </w:rPr>
+              <w:t xml:space="preserve"> </w:t>
+            </w:r>
+            <m:oMath>
+              <m:r>
+                <m:t>h</m:t>
+              </m:r>
+              <m:d>
+                <m:dPr>
+                  <m:begChr m:val="("/>
+                  <m:endChr m:val=")"/>
+                  <m:sepChr m:val=""/>
+                  <m:grow/>
+                </m:dPr>
+                <m:e>
+                  <m:r>
+                    <m:rPr>
+                      <m:sty m:val="p"/>
+                    </m:rPr>
+                    <m:t>−</m:t>
+                  </m:r>
+                  <m:r>
+                    <m:t>1</m:t>
+                  </m:r>
+                </m:e>
+              </m:d>
+              <m:r>
+                <m:rPr>
+                  <m:sty m:val="p"/>
+                </m:rPr>
+                <m:t>=</m:t>
+              </m:r>
+              <m:r>
+                <m:t>0</m:t>
+              </m:r>
+            </m:oMath>
+            <w:r>
+              <w:rPr>
+                <w:rtl/>
+              </w:rPr>
+              <w:t xml:space="preserve"> </w:t>
+            </w:r>
+            <w:r>
+              <w:rPr>
+                <w:rtl/>
+              </w:rPr>
+              <w:t xml:space="preserve">و</w:t>
+            </w:r>
+            <w:r>
+              <w:rPr>
+                <w:rtl/>
+              </w:rPr>
+              <w:t xml:space="preserve"> </w:t>
+            </w:r>
+            <m:oMath>
+              <m:r>
+                <m:t>h</m:t>
+              </m:r>
+              <m:d>
+                <m:dPr>
+                  <m:begChr m:val="("/>
+                  <m:endChr m:val=")"/>
+                  <m:sepChr m:val=""/>
+                  <m:grow/>
+                </m:dPr>
+                <m:e>
+                  <m:r>
+                    <m:t>1</m:t>
+                  </m:r>
+                </m:e>
+              </m:d>
+              <m:r>
+                <m:rPr>
+                  <m:sty m:val="p"/>
+                </m:rPr>
+                <m:t>=</m:t>
+              </m:r>
+              <m:r>
+                <m:t>2</m:t>
+              </m:r>
+            </m:oMath>
+            <w:r>
+              <w:rPr>
+                <w:rtl/>
+              </w:rPr>
+              <w:t xml:space="preserve"> </w:t>
+            </w:r>
+            <w:r>
+              <w:rPr>
+                <w:rtl/>
+              </w:rPr>
+              <w:t xml:space="preserve">، أي</w:t>
+            </w:r>
+            <w:r>
+              <w:rPr>
+                <w:rtl/>
+              </w:rPr>
+              <w:t xml:space="preserve"> </w:t>
+            </w:r>
+            <m:oMath>
+              <m:r>
+                <m:t>h</m:t>
+              </m:r>
+              <m:d>
+                <m:dPr>
+                  <m:begChr m:val="("/>
+                  <m:endChr m:val=")"/>
+                  <m:sepChr m:val=""/>
+                  <m:grow/>
+                </m:dPr>
+                <m:e>
+                  <m:r>
+                    <m:rPr>
+                      <m:sty m:val="p"/>
+                    </m:rPr>
+                    <m:t>−</m:t>
+                  </m:r>
+                  <m:r>
+                    <m:t>1</m:t>
+                  </m:r>
+                </m:e>
+              </m:d>
+              <m:r>
+                <m:rPr>
+                  <m:sty m:val="p"/>
+                </m:rPr>
+                <m:t>≠</m:t>
+              </m:r>
+              <m:r>
+                <m:t>h</m:t>
+              </m:r>
+              <m:d>
+                <m:dPr>
+                  <m:begChr m:val="("/>
+                  <m:endChr m:val=")"/>
+                  <m:sepChr m:val=""/>
+                  <m:grow/>
+                </m:dPr>
+                <m:e>
+                  <m:r>
+                    <m:t>1</m:t>
+                  </m:r>
+                </m:e>
+              </m:d>
+            </m:oMath>
+            <w:r>
+              <w:rPr>
+                <w:rtl/>
+              </w:rPr>
+              <w:t xml:space="preserve">.</w:t>
+            </w:r>
+          </w:p>
+          <w:p>
+            <w:pPr>
+              <w:numPr>
+                <w:ilvl w:val="0"/>
+                <w:numId w:val="1013"/>
+              </w:numPr>
+              <w:bidi/>
+            </w:pPr>
+            <w:r>
+              <w:rPr>
+                <w:rtl/>
+              </w:rPr>
+              <w:t xml:space="preserve">«من أجل كل عدد حقيقي</w:t>
+            </w:r>
+            <w:r>
+              <w:rPr>
+                <w:rtl/>
+              </w:rPr>
+              <w:t xml:space="preserve"> </w:t>
+            </w:r>
+            <m:oMath>
+              <m:r>
+                <m:t>x</m:t>
+              </m:r>
+            </m:oMath>
+            <w:r>
+              <w:rPr>
+                <w:rtl/>
+              </w:rPr>
+              <w:t xml:space="preserve">:</w:t>
+            </w:r>
+            <w:r>
+              <w:rPr>
+                <w:rtl/>
+              </w:rPr>
+              <w:t xml:space="preserve"> </w:t>
+            </w:r>
+            <m:oMath>
+              <m:sSup>
+                <m:e>
+                  <m:r>
+                    <m:t>x</m:t>
+                  </m:r>
+                </m:e>
+                <m:sup>
+                  <m:r>
+                    <m:t>2</m:t>
+                  </m:r>
+                </m:sup>
+              </m:sSup>
+              <m:r>
+                <m:rPr>
+                  <m:sty m:val="p"/>
+                </m:rPr>
+                <m:t>≥</m:t>
+              </m:r>
+              <m:r>
+                <m:t>x</m:t>
+              </m:r>
+            </m:oMath>
+            <w:r>
+              <w:rPr>
+                <w:rtl/>
+              </w:rPr>
+              <w:t xml:space="preserve">»:</w:t>
+            </w:r>
+            <w:r>
+              <w:rPr>
+                <w:rtl/>
+              </w:rPr>
+              <w:t xml:space="preserve"> </w:t>
+            </w:r>
+            <w:r>
+              <w:rPr>
+                <w:b/>
+                <w:bCs/>
+                <w:rtl/>
+              </w:rPr>
+              <w:t xml:space="preserve">خاطئة</w:t>
+            </w:r>
+            <w:r>
+              <w:rPr>
+                <w:rtl/>
+              </w:rPr>
+              <w:t xml:space="preserve"> </w:t>
+            </w:r>
+            <w:r>
+              <w:rPr>
+                <w:rtl/>
+              </w:rPr>
+              <w:t xml:space="preserve">، المثال المضاد</w:t>
+            </w:r>
+            <w:r>
+              <w:rPr>
+                <w:rtl/>
+              </w:rPr>
+              <w:t xml:space="preserve"> </w:t>
+            </w:r>
+            <m:oMath>
+              <m:r>
+                <m:t>x</m:t>
+              </m:r>
+              <m:r>
+                <m:rPr>
+                  <m:sty m:val="p"/>
+                </m:rPr>
+                <m:t>=</m:t>
+              </m:r>
+              <m:f>
+                <m:fPr>
+                  <m:type m:val="bar"/>
+                </m:fPr>
+                <m:num>
+                  <m:r>
+                    <m:t>1</m:t>
+                  </m:r>
+                </m:num>
+                <m:den>
+                  <m:r>
+                    <m:t>2</m:t>
+                  </m:r>
+                </m:den>
+              </m:f>
+            </m:oMath>
+            <w:r>
+              <w:rPr>
+                <w:rtl/>
+              </w:rPr>
+              <w:t xml:space="preserve">:</w:t>
+            </w:r>
+            <w:r>
+              <w:rPr>
+                <w:rtl/>
+              </w:rPr>
+              <w:t xml:space="preserve"> </w:t>
+            </w:r>
+            <m:oMath>
+              <m:r>
+                <m:rPr>
+                  <m:sty m:val="p"/>
+                </m:rPr>
+                <m:t>(</m:t>
+              </m:r>
+              <m:f>
+                <m:fPr>
+                  <m:type m:val="bar"/>
+                </m:fPr>
+                <m:num>
+                  <m:r>
+                    <m:t>1</m:t>
+                  </m:r>
+                </m:num>
+                <m:den>
+                  <m:r>
+                    <m:t>2</m:t>
+                  </m:r>
+                </m:den>
+              </m:f>
+              <m:sSup>
+                <m:e>
+                  <m:r>
+                    <m:rPr>
+                      <m:sty m:val="p"/>
+                    </m:rPr>
+                    <m:t>)</m:t>
+                  </m:r>
+                </m:e>
+                <m:sup>
+                  <m:r>
+                    <m:t>2</m:t>
+                  </m:r>
+                </m:sup>
+              </m:sSup>
+              <m:r>
+                <m:rPr>
+                  <m:sty m:val="p"/>
+                </m:rPr>
+                <m:t>=</m:t>
+              </m:r>
+              <m:f>
+                <m:fPr>
+                  <m:type m:val="bar"/>
+                </m:fPr>
+                <m:num>
+                  <m:r>
+                    <m:t>1</m:t>
+                  </m:r>
+                </m:num>
+                <m:den>
+                  <m:r>
+                    <m:t>4</m:t>
+                  </m:r>
+                </m:den>
+              </m:f>
+              <m:r>
+                <m:rPr>
+                  <m:sty m:val="p"/>
+                </m:rPr>
+                <m:t>&lt;</m:t>
+              </m:r>
+              <m:f>
+                <m:fPr>
+                  <m:type m:val="bar"/>
+                </m:fPr>
+                <m:num>
+                  <m:r>
+                    <m:t>1</m:t>
+                  </m:r>
+                </m:num>
+                <m:den>
+                  <m:r>
+                    <m:t>2</m:t>
+                  </m:r>
+                </m:den>
+              </m:f>
+            </m:oMath>
+            <w:r>
+              <w:rPr>
+                <w:rtl/>
+              </w:rPr>
+              <w:t xml:space="preserve">.</w:t>
+            </w:r>
+          </w:p>
+          <w:p>
+            <w:pPr>
+              <w:numPr>
+                <w:ilvl w:val="0"/>
+                <w:numId w:val="1013"/>
+              </w:numPr>
+              <w:bidi/>
+            </w:pPr>
+            <w:r>
+              <w:rPr>
+                <w:rtl/>
+              </w:rPr>
+              <w:t xml:space="preserve">«الدالة مربع متزايدة على</w:t>
+            </w:r>
+            <w:r>
+              <w:rPr>
+                <w:rtl/>
+              </w:rPr>
+              <w:t xml:space="preserve"> </w:t>
+            </w:r>
+            <m:oMath>
+              <m:r>
+                <m:rPr>
+                  <m:sty m:val="p"/>
+                  <m:scr m:val="double-struck"/>
+                </m:rPr>
+                <m:t>R</m:t>
+              </m:r>
+            </m:oMath>
+            <w:r>
+              <w:rPr>
+                <w:rtl/>
+              </w:rPr>
+              <w:t xml:space="preserve">»:</w:t>
+            </w:r>
+            <w:r>
+              <w:rPr>
+                <w:rtl/>
+              </w:rPr>
+              <w:t xml:space="preserve"> </w:t>
+            </w:r>
+            <w:r>
+              <w:rPr>
+                <w:b/>
+                <w:bCs/>
+                <w:rtl/>
+              </w:rPr>
+              <w:t xml:space="preserve">خاطئة</w:t>
+            </w:r>
+            <w:r>
+              <w:rPr>
+                <w:rtl/>
+              </w:rPr>
+              <w:t xml:space="preserve"> </w:t>
+            </w:r>
+            <w:r>
+              <w:rPr>
+                <w:rtl/>
+              </w:rPr>
+              <w:t xml:space="preserve">، لأن</w:t>
+            </w:r>
+            <w:r>
+              <w:rPr>
+                <w:rtl/>
+              </w:rPr>
+              <w:t xml:space="preserve"> </w:t>
+            </w:r>
+            <m:oMath>
+              <m:r>
+                <m:rPr>
+                  <m:sty m:val="p"/>
+                </m:rPr>
+                <m:t>−</m:t>
+              </m:r>
+              <m:r>
+                <m:t>2</m:t>
+              </m:r>
+              <m:r>
+                <m:rPr>
+                  <m:sty m:val="p"/>
+                </m:rPr>
+                <m:t>&lt;</m:t>
+              </m:r>
+              <m:r>
+                <m:t>1</m:t>
+              </m:r>
+            </m:oMath>
+            <w:r>
+              <w:rPr>
+                <w:rtl/>
+              </w:rPr>
+              <w:t xml:space="preserve"> </w:t>
+            </w:r>
+            <w:r>
+              <w:rPr>
+                <w:rtl/>
+              </w:rPr>
+              <w:t xml:space="preserve">لكن</w:t>
+            </w:r>
+            <w:r>
+              <w:rPr>
+                <w:rtl/>
+              </w:rPr>
+              <w:t xml:space="preserve"> </w:t>
+            </w:r>
+            <m:oMath>
+              <m:sSup>
+                <m:e>
+                  <m:d>
+                    <m:dPr>
+                      <m:begChr m:val="("/>
+                      <m:endChr m:val=")"/>
+                      <m:sepChr m:val=""/>
+                      <m:grow/>
+                    </m:dPr>
+                    <m:e>
+                      <m:r>
+                        <m:rPr>
+                          <m:sty m:val="p"/>
+                        </m:rPr>
+                        <m:t>−</m:t>
+                      </m:r>
+                      <m:r>
+                        <m:t>2</m:t>
+                      </m:r>
+                    </m:e>
+                  </m:d>
+                </m:e>
+                <m:sup>
+                  <m:r>
+                    <m:t>2</m:t>
+                  </m:r>
+                </m:sup>
+              </m:sSup>
+              <m:r>
+                <m:rPr>
+                  <m:sty m:val="p"/>
+                </m:rPr>
+                <m:t>=</m:t>
+              </m:r>
+              <m:r>
+                <m:t>4</m:t>
+              </m:r>
+              <m:r>
+                <m:rPr>
+                  <m:sty m:val="p"/>
+                </m:rPr>
+                <m:t>&gt;</m:t>
+              </m:r>
+              <m:sSup>
+                <m:e>
+                  <m:r>
+                    <m:t>1</m:t>
+                  </m:r>
+                </m:e>
+                <m:sup>
+                  <m:r>
+                    <m:t>2</m:t>
+                  </m:r>
+                </m:sup>
+              </m:sSup>
+              <m:r>
+                <m:rPr>
+                  <m:sty m:val="p"/>
+                </m:rPr>
+                <m:t>=</m:t>
+              </m:r>
+              <m:r>
+                <m:t>1</m:t>
+              </m:r>
+            </m:oMath>
+            <w:r>
+              <w:rPr>
+                <w:rtl/>
+              </w:rPr>
+              <w:t xml:space="preserve">.</w:t>
+            </w:r>
+          </w:p>
+          <w:p>
+            <w:pPr>
+              <w:numPr>
+                <w:ilvl w:val="0"/>
+                <w:numId w:val="1013"/>
+              </w:numPr>
+              <w:bidi/>
+            </w:pPr>
+            <w:r>
+              <w:rPr>
+                <w:rtl/>
+              </w:rPr>
+              <w:t xml:space="preserve">«إذا كان</w:t>
+            </w:r>
+            <w:r>
+              <w:rPr>
+                <w:rtl/>
+              </w:rPr>
+              <w:t xml:space="preserve"> </w:t>
+            </w:r>
+            <m:oMath>
+              <m:sSup>
+                <m:e>
+                  <m:r>
+                    <m:t>a</m:t>
+                  </m:r>
+                </m:e>
+                <m:sup>
+                  <m:r>
+                    <m:t>2</m:t>
+                  </m:r>
+                </m:sup>
+              </m:sSup>
+              <m:r>
+                <m:rPr>
+                  <m:sty m:val="p"/>
+                </m:rPr>
+                <m:t>=</m:t>
+              </m:r>
+              <m:sSup>
+                <m:e>
+                  <m:r>
+                    <m:t>b</m:t>
+                  </m:r>
+                </m:e>
+                <m:sup>
+                  <m:r>
+                    <m:t>2</m:t>
+                  </m:r>
+                </m:sup>
+              </m:sSup>
+            </m:oMath>
+            <w:r>
+              <w:rPr>
+                <w:rtl/>
+              </w:rPr>
+              <w:t xml:space="preserve"> </w:t>
+            </w:r>
+            <w:r>
+              <w:rPr>
+                <w:rtl/>
+              </w:rPr>
+              <w:t xml:space="preserve">فإن</w:t>
+            </w:r>
+            <w:r>
+              <w:rPr>
+                <w:rtl/>
+              </w:rPr>
+              <w:t xml:space="preserve"> </w:t>
+            </w:r>
+            <m:oMath>
+              <m:r>
+                <m:t>a</m:t>
+              </m:r>
+              <m:r>
+                <m:rPr>
+                  <m:sty m:val="p"/>
+                </m:rPr>
+                <m:t>=</m:t>
+              </m:r>
+              <m:r>
+                <m:t>b</m:t>
+              </m:r>
+            </m:oMath>
+            <w:r>
+              <w:rPr>
+                <w:rtl/>
+              </w:rPr>
+              <w:t xml:space="preserve">»:</w:t>
+            </w:r>
+            <w:r>
+              <w:rPr>
+                <w:rtl/>
+              </w:rPr>
+              <w:t xml:space="preserve"> </w:t>
+            </w:r>
+            <w:r>
+              <w:rPr>
+                <w:b/>
+                <w:bCs/>
+                <w:rtl/>
+              </w:rPr>
+              <w:t xml:space="preserve">خاطئة</w:t>
+            </w:r>
+            <w:r>
+              <w:rPr>
+                <w:rtl/>
+              </w:rPr>
+              <w:t xml:space="preserve"> </w:t>
+            </w:r>
+            <w:r>
+              <w:rPr>
+                <w:rtl/>
+              </w:rPr>
+              <w:t xml:space="preserve">، المثال المضاد</w:t>
+            </w:r>
+            <w:r>
+              <w:rPr>
+                <w:rtl/>
+              </w:rPr>
+              <w:t xml:space="preserve"> </w:t>
+            </w:r>
+            <m:oMath>
+              <m:r>
+                <m:t>a</m:t>
+              </m:r>
+              <m:r>
+                <m:rPr>
+                  <m:sty m:val="p"/>
+                </m:rPr>
+                <m:t>=</m:t>
+              </m:r>
+              <m:r>
+                <m:t>3</m:t>
+              </m:r>
+            </m:oMath>
+            <w:r>
+              <w:rPr>
+                <w:rtl/>
+              </w:rPr>
+              <w:t xml:space="preserve"> </w:t>
+            </w:r>
+            <w:r>
+              <w:rPr>
+                <w:rtl/>
+              </w:rPr>
+              <w:t xml:space="preserve">و</w:t>
+            </w:r>
+            <w:r>
+              <w:rPr>
+                <w:rtl/>
+              </w:rPr>
+              <w:t xml:space="preserve"> </w:t>
+            </w:r>
+            <m:oMath>
+              <m:r>
+                <m:t>b</m:t>
+              </m:r>
+              <m:r>
+                <m:rPr>
+                  <m:sty m:val="p"/>
+                </m:rPr>
+                <m:t>=</m:t>
+              </m:r>
+              <m:r>
+                <m:rPr>
+                  <m:sty m:val="p"/>
+                </m:rPr>
+                <m:t>−</m:t>
+              </m:r>
+              <m:r>
+                <m:t>3</m:t>
+              </m:r>
+            </m:oMath>
             <w:r>
               <w:rPr>
                 <w:rtl/>
@@ -9510,7 +11886,7 @@
             <w:pPr>
               <w:numPr>
                 <w:ilvl w:val="0"/>
-                <w:numId w:val="1012"/>
+                <w:numId w:val="1014"/>
               </w:numPr>
               <w:bidi/>
             </w:pPr>
@@ -9706,7 +12082,7 @@
             <w:pPr>
               <w:numPr>
                 <w:ilvl w:val="0"/>
-                <w:numId w:val="1012"/>
+                <w:numId w:val="1014"/>
               </w:numPr>
               <w:bidi/>
             </w:pPr>
@@ -9902,7 +12278,7 @@
             <w:pPr>
               <w:numPr>
                 <w:ilvl w:val="0"/>
-                <w:numId w:val="1012"/>
+                <w:numId w:val="1014"/>
               </w:numPr>
               <w:bidi/>
             </w:pPr>
@@ -10144,7 +12520,7 @@
             <w:pPr>
               <w:numPr>
                 <w:ilvl w:val="0"/>
-                <w:numId w:val="1013"/>
+                <w:numId w:val="1015"/>
               </w:numPr>
               <w:bidi/>
             </w:pPr>
@@ -10271,7 +12647,7 @@
             <w:pPr>
               <w:numPr>
                 <w:ilvl w:val="0"/>
-                <w:numId w:val="1013"/>
+                <w:numId w:val="1015"/>
               </w:numPr>
               <w:bidi/>
             </w:pPr>
@@ -10578,7 +12954,7 @@
             <w:pPr>
               <w:numPr>
                 <w:ilvl w:val="0"/>
-                <w:numId w:val="1014"/>
+                <w:numId w:val="1016"/>
               </w:numPr>
               <w:bidi/>
             </w:pPr>
@@ -10909,7 +13285,7 @@
             <w:pPr>
               <w:numPr>
                 <w:ilvl w:val="0"/>
-                <w:numId w:val="1014"/>
+                <w:numId w:val="1016"/>
               </w:numPr>
               <w:bidi/>
             </w:pPr>
@@ -11170,7 +13546,7 @@
             <w:pPr>
               <w:numPr>
                 <w:ilvl w:val="0"/>
-                <w:numId w:val="1014"/>
+                <w:numId w:val="1016"/>
               </w:numPr>
               <w:bidi/>
             </w:pPr>
@@ -11733,7 +14109,7 @@
               <w:drawing>
                 <wp:inline>
                   <wp:extent cx="2880360" cy="790956"/>
-                  <wp:docPr id="5" name="Picture 5"/>
+                  <wp:docPr id="6" name="Picture 6"/>
                   <wp:cNvGraphicFramePr>
                     <a:graphicFrameLocks noChangeAspect="1"/>
                   </wp:cNvGraphicFramePr>
@@ -11745,7 +14121,7 @@
                           <pic:cNvPicPr/>
                         </pic:nvPicPr>
                         <pic:blipFill>
-                          <a:blip r:embed="rId13"/>
+                          <a:blip r:embed="rId14"/>
                           <a:stretch>
                             <a:fillRect/>
                           </a:stretch>
@@ -11992,7 +14368,7 @@
             <w:pPr>
               <w:numPr>
                 <w:ilvl w:val="0"/>
-                <w:numId w:val="1015"/>
+                <w:numId w:val="1017"/>
               </w:numPr>
               <w:bidi/>
             </w:pPr>
@@ -12153,7 +14529,7 @@
             <w:pPr>
               <w:numPr>
                 <w:ilvl w:val="0"/>
-                <w:numId w:val="1015"/>
+                <w:numId w:val="1017"/>
               </w:numPr>
               <w:bidi/>
             </w:pPr>
@@ -12472,7 +14848,7 @@
             <w:pPr>
               <w:numPr>
                 <w:ilvl w:val="0"/>
-                <w:numId w:val="1016"/>
+                <w:numId w:val="1018"/>
               </w:numPr>
               <w:bidi/>
             </w:pPr>
@@ -12643,7 +15019,7 @@
             <w:pPr>
               <w:numPr>
                 <w:ilvl w:val="0"/>
-                <w:numId w:val="1016"/>
+                <w:numId w:val="1018"/>
               </w:numPr>
               <w:bidi/>
             </w:pPr>
@@ -13138,7 +15514,7 @@
             <w:pPr>
               <w:numPr>
                 <w:ilvl w:val="0"/>
-                <w:numId w:val="1017"/>
+                <w:numId w:val="1019"/>
               </w:numPr>
               <w:bidi/>
             </w:pPr>
@@ -13505,7 +15881,7 @@
             <w:pPr>
               <w:numPr>
                 <w:ilvl w:val="0"/>
-                <w:numId w:val="1017"/>
+                <w:numId w:val="1019"/>
               </w:numPr>
               <w:bidi/>
             </w:pPr>
@@ -14104,7 +16480,7 @@
             <w:pPr>
               <w:numPr>
                 <w:ilvl w:val="0"/>
-                <w:numId w:val="1018"/>
+                <w:numId w:val="1020"/>
               </w:numPr>
               <w:bidi/>
             </w:pPr>
@@ -14232,7 +16608,7 @@
             <w:pPr>
               <w:numPr>
                 <w:ilvl w:val="0"/>
-                <w:numId w:val="1018"/>
+                <w:numId w:val="1020"/>
               </w:numPr>
               <w:bidi/>
             </w:pPr>
@@ -14383,7 +16759,7 @@
             <w:pPr>
               <w:numPr>
                 <w:ilvl w:val="0"/>
-                <w:numId w:val="1018"/>
+                <w:numId w:val="1020"/>
               </w:numPr>
               <w:bidi/>
             </w:pPr>
@@ -14606,7 +16982,7 @@
             <w:pPr>
               <w:numPr>
                 <w:ilvl w:val="0"/>
-                <w:numId w:val="1018"/>
+                <w:numId w:val="1020"/>
               </w:numPr>
               <w:bidi/>
             </w:pPr>
@@ -14803,7 +17179,7 @@
                     <w:drawing>
                       <wp:inline>
                         <wp:extent cx="1920240" cy="1522476"/>
-                        <wp:docPr id="6" name="Picture 6"/>
+                        <wp:docPr id="7" name="Picture 7"/>
                         <wp:cNvGraphicFramePr>
                           <a:graphicFrameLocks noChangeAspect="1"/>
                         </wp:cNvGraphicFramePr>
@@ -14815,7 +17191,7 @@
                                 <pic:cNvPicPr/>
                               </pic:nvPicPr>
                               <pic:blipFill>
-                                <a:blip r:embed="rId14"/>
+                                <a:blip r:embed="rId15"/>
                                 <a:stretch>
                                   <a:fillRect/>
                                 </a:stretch>
@@ -15131,7 +17507,7 @@
                   <w:pPr>
                     <w:numPr>
                       <w:ilvl w:val="0"/>
-                      <w:numId w:val="1019"/>
+                      <w:numId w:val="1021"/>
                     </w:numPr>
                     <w:bidi/>
                   </w:pPr>
@@ -15245,7 +17621,7 @@
                   <w:pPr>
                     <w:numPr>
                       <w:ilvl w:val="0"/>
-                      <w:numId w:val="1019"/>
+                      <w:numId w:val="1021"/>
                     </w:numPr>
                     <w:bidi/>
                   </w:pPr>
@@ -15883,7 +18259,7 @@
             <w:pPr>
               <w:numPr>
                 <w:ilvl w:val="0"/>
-                <w:numId w:val="1020"/>
+                <w:numId w:val="1022"/>
               </w:numPr>
               <w:bidi/>
             </w:pPr>
@@ -15973,7 +18349,7 @@
             <w:pPr>
               <w:numPr>
                 <w:ilvl w:val="0"/>
-                <w:numId w:val="1020"/>
+                <w:numId w:val="1022"/>
               </w:numPr>
               <w:bidi/>
             </w:pPr>
@@ -16104,7 +18480,7 @@
             <w:pPr>
               <w:numPr>
                 <w:ilvl w:val="0"/>
-                <w:numId w:val="1020"/>
+                <w:numId w:val="1022"/>
               </w:numPr>
               <w:bidi/>
             </w:pPr>
@@ -16248,7 +18624,7 @@
             <w:pPr>
               <w:numPr>
                 <w:ilvl w:val="0"/>
-                <w:numId w:val="1020"/>
+                <w:numId w:val="1022"/>
               </w:numPr>
               <w:bidi/>
             </w:pPr>
@@ -17145,7 +19521,7 @@
             <w:pPr>
               <w:numPr>
                 <w:ilvl w:val="0"/>
-                <w:numId w:val="1021"/>
+                <w:numId w:val="1023"/>
               </w:numPr>
               <w:bidi/>
             </w:pPr>
@@ -17419,7 +19795,7 @@
             <w:pPr>
               <w:numPr>
                 <w:ilvl w:val="0"/>
-                <w:numId w:val="1021"/>
+                <w:numId w:val="1023"/>
               </w:numPr>
               <w:bidi/>
             </w:pPr>
@@ -17701,7 +20077,7 @@
               <w:drawing>
                 <wp:inline>
                   <wp:extent cx="2468880" cy="758952"/>
-                  <wp:docPr id="7" name="Picture 7"/>
+                  <wp:docPr id="8" name="Picture 8"/>
                   <wp:cNvGraphicFramePr>
                     <a:graphicFrameLocks noChangeAspect="1"/>
                   </wp:cNvGraphicFramePr>
@@ -17713,7 +20089,7 @@
                           <pic:cNvPicPr/>
                         </pic:nvPicPr>
                         <pic:blipFill>
-                          <a:blip r:embed="rId15"/>
+                          <a:blip r:embed="rId16"/>
                           <a:stretch>
                             <a:fillRect/>
                           </a:stretch>
@@ -18654,6 +21030,91 @@
                       <w:rtl/>
                     </w:rPr>
                     <w:t xml:space="preserve">؟</w:t>
+                  </w:r>
+                </w:p>
+              </w:tc>
+            </w:tr>
+            <w:tr>
+              <w:tc>
+                <w:tcPr/>
+                <w:p>
+                  <w:pPr>
+                    <w:pStyle w:val="Compact"/>
+                    <w:bidi/>
+                    <w:jc w:val="left"/>
+                  </w:pPr>
+                  <w:r>
+                    <w:rPr>
+                      <w:rtl/>
+                    </w:rPr>
+                    <w:t xml:space="preserve">نحسب صوراً في جدول ، نعلّم النقط ونصلها بخط منحنٍ.</w:t>
+                  </w:r>
+                </w:p>
+              </w:tc>
+              <w:tc>
+                <w:tcPr/>
+                <w:p>
+                  <w:pPr>
+                    <w:pStyle w:val="Compact"/>
+                    <w:bidi/>
+                    <w:jc w:val="left"/>
+                  </w:pPr>
+                  <w:r>
+                    <w:rPr>
+                      <w:rtl/>
+                    </w:rPr>
+                    <w:t xml:space="preserve">رسم منحنى انطلاقاً من الدستور</w:t>
+                  </w:r>
+                </w:p>
+              </w:tc>
+            </w:tr>
+            <w:tr>
+              <w:tc>
+                <w:tcPr/>
+                <w:p>
+                  <w:pPr>
+                    <w:pStyle w:val="Compact"/>
+                    <w:bidi/>
+                    <w:jc w:val="left"/>
+                  </w:pPr>
+                  <w:r>
+                    <w:rPr>
+                      <w:rtl/>
+                    </w:rPr>
+                    <w:t xml:space="preserve">نعطي مثالاً واحداً لا تتحقق من أجله العبارة.</w:t>
+                  </w:r>
+                </w:p>
+              </w:tc>
+              <w:tc>
+                <w:tcPr/>
+                <w:p>
+                  <w:pPr>
+                    <w:pStyle w:val="Compact"/>
+                    <w:bidi/>
+                    <w:jc w:val="left"/>
+                  </w:pPr>
+                  <w:r>
+                    <w:rPr>
+                      <w:rtl/>
+                    </w:rPr>
+                    <w:t xml:space="preserve">إثبات أن عبارة «لكل</w:t>
+                  </w:r>
+                  <w:r>
+                    <w:rPr>
+                      <w:rtl/>
+                    </w:rPr>
+                    <w:t xml:space="preserve"> </w:t>
+                  </w:r>
+                  <m:oMath>
+                    <m:r>
+                      <m:t>x</m:t>
+                    </m:r>
+                  </m:oMath>
+                  <w:r>
+                    <w:rPr>
+                      <w:rtl/>
+                    </w:rPr>
+                    <w:t xml:space="preserve">» خاطئة</w:t>
                   </w:r>
                 </w:p>
               </w:tc>
@@ -19139,8 +21600,8 @@
     </w:p>
     <w:bookmarkEnd w:id="27"/>
     <w:sectPr>
-      <w:headerReference w:type="default" r:id="rId16"/>
-      <w:footerReference w:type="default" r:id="rId17"/>
+      <w:headerReference w:type="default" r:id="rId17"/>
+      <w:footerReference w:type="default" r:id="rId18"/>
       <w:pgSz w:h="16838" w:w="11906"/>
       <w:pgMar w:bottom="1134" w:left="964" w:right="964" w:top="1134" w:header="454" w:footer="454" w:gutter="0"/>
     </w:sectPr>
@@ -19606,18 +22067,6 @@
     <w:abstractNumId w:val="991"/>
   </w:num>
   <w:num w:numId="1009">
-    <w:abstractNumId w:val="991"/>
-  </w:num>
-  <w:num w:numId="1010">
-    <w:abstractNumId w:val="991"/>
-  </w:num>
-  <w:num w:numId="1011">
-    <w:abstractNumId w:val="991"/>
-  </w:num>
-  <w:num w:numId="1012">
-    <w:abstractNumId w:val="991"/>
-  </w:num>
-  <w:num w:numId="1013">
     <w:abstractNumId w:val="99201"/>
     <w:lvlOverride w:ilvl="0">
       <w:startOverride w:val="1"/>
@@ -19647,25 +22096,22 @@
       <w:startOverride w:val="1"/>
     </w:lvlOverride>
   </w:num>
+  <w:num w:numId="1010">
+    <w:abstractNumId w:val="991"/>
+  </w:num>
+  <w:num w:numId="1011">
+    <w:abstractNumId w:val="991"/>
+  </w:num>
+  <w:num w:numId="1012">
+    <w:abstractNumId w:val="991"/>
+  </w:num>
+  <w:num w:numId="1013">
+    <w:abstractNumId w:val="991"/>
+  </w:num>
   <w:num w:numId="1014">
     <w:abstractNumId w:val="991"/>
   </w:num>
   <w:num w:numId="1015">
-    <w:abstractNumId w:val="991"/>
-  </w:num>
-  <w:num w:numId="1016">
-    <w:abstractNumId w:val="991"/>
-  </w:num>
-  <w:num w:numId="1017">
-    <w:abstractNumId w:val="991"/>
-  </w:num>
-  <w:num w:numId="1018">
-    <w:abstractNumId w:val="991"/>
-  </w:num>
-  <w:num w:numId="1019">
-    <w:abstractNumId w:val="991"/>
-  </w:num>
-  <w:num w:numId="1020">
     <w:abstractNumId w:val="99201"/>
     <w:lvlOverride w:ilvl="0">
       <w:startOverride w:val="1"/>
@@ -19695,7 +22141,55 @@
       <w:startOverride w:val="1"/>
     </w:lvlOverride>
   </w:num>
+  <w:num w:numId="1016">
+    <w:abstractNumId w:val="991"/>
+  </w:num>
+  <w:num w:numId="1017">
+    <w:abstractNumId w:val="991"/>
+  </w:num>
+  <w:num w:numId="1018">
+    <w:abstractNumId w:val="991"/>
+  </w:num>
+  <w:num w:numId="1019">
+    <w:abstractNumId w:val="991"/>
+  </w:num>
+  <w:num w:numId="1020">
+    <w:abstractNumId w:val="991"/>
+  </w:num>
   <w:num w:numId="1021">
+    <w:abstractNumId w:val="991"/>
+  </w:num>
+  <w:num w:numId="1022">
+    <w:abstractNumId w:val="99201"/>
+    <w:lvlOverride w:ilvl="0">
+      <w:startOverride w:val="1"/>
+    </w:lvlOverride>
+    <w:lvlOverride w:ilvl="1">
+      <w:startOverride w:val="1"/>
+    </w:lvlOverride>
+    <w:lvlOverride w:ilvl="2">
+      <w:startOverride w:val="1"/>
+    </w:lvlOverride>
+    <w:lvlOverride w:ilvl="3">
+      <w:startOverride w:val="1"/>
+    </w:lvlOverride>
+    <w:lvlOverride w:ilvl="4">
+      <w:startOverride w:val="1"/>
+    </w:lvlOverride>
+    <w:lvlOverride w:ilvl="5">
+      <w:startOverride w:val="1"/>
+    </w:lvlOverride>
+    <w:lvlOverride w:ilvl="6">
+      <w:startOverride w:val="1"/>
+    </w:lvlOverride>
+    <w:lvlOverride w:ilvl="7">
+      <w:startOverride w:val="1"/>
+    </w:lvlOverride>
+    <w:lvlOverride w:ilvl="8">
+      <w:startOverride w:val="1"/>
+    </w:lvlOverride>
+  </w:num>
+  <w:num w:numId="1023">
     <w:abstractNumId w:val="991"/>
   </w:num>
 </w:numbering>

</xml_diff>